<commit_message>
Add SS2 report update and NA²Q S2 report figures
- SS2 Report.docx: updated
- report_figures/scenario_2/na2q/coverage_curve.png: new
- report_figures/scenario_2/na2q/reward_curve.png: new
</commit_message>
<xml_diff>
--- a/SS2 Report.docx
+++ b/SS2 Report.docx
@@ -47,7 +47,7 @@
           <w:sz w:val="24"/>
           <w:szCs w:val="24"/>
         </w:rPr>
-        <w:t xml:space="preserve">SS2 Technical Report</w:t>
+        <w:t xml:space="preserve">Special Subject Report</w:t>
       </w:r>
     </w:p>
     <w:p>
@@ -131,7 +131,7 @@
           <w:sz w:val="22"/>
           <w:szCs w:val="22"/>
         </w:rPr>
-        <w:t xml:space="preserve">We evaluate both methods on two scenarios that differ in scale rather than in dynamics. Scenario 1 is small (5 sensors, 6 targets, 3×3 grid) and is run for five random seeds per algorithm, giving us mean-and-standard-deviation curves we can read confidently. Scenario 2 is large (50 sensors, 60 targets, 10×10 grid) and is run for a single seed per algorithm because the per-run cost is roughly an order of magnitude higher. Two non-learning baselines accompany every plot: a uniform-random heading policy and a centralised greedy policy that solves a Hungarian assignment of sensors to targets at every step using full state information.</w:t>
+        <w:t xml:space="preserve">We evaluate both methods on two scenarios that differ in scale rather than in dynamics. Scenario 1 is small (5 sensors, 6 targets, 3×3 grid) and is run for five random seeds per algorithm, giving us mean-and-standard-deviation curves we can read confidently. Scenario 2 is large (50 sensors, 60 targets, 10×10 grid) and is run for a single seed per algorithm because the per-run cost is roughly an order of magnitude higher in compute. Two non-learning baselines accompany every plot: a uniform-random heading policy and a centralised greedy policy that solves a Hungarian assignment of sensors to targets at every step using full state information.</w:t>
       </w:r>
     </w:p>
     <w:p>
@@ -167,7 +167,7 @@
           <w:sz w:val="22"/>
           <w:szCs w:val="22"/>
         </w:rPr>
-        <w:t xml:space="preserve">On Scenario 2 only HiT-MAC has been trained at the time of writing; it plateaus at ~60% coverage, only marginally above the 56% random baseline and 20 percentage points below the 80% greedy oracle, indicating that scaling DSN coordination from 5 to 50 agents is a substantively harder problem rather than a quantitative shift. We additionally document an A3C shared-memory race condition that caused one of the five HiT-MAC seeds (seed 4) on Scenario 1 to collapse below random performance after ~12,500 episodes, inflating the naïve five-seed standard deviation from ~0.9% to 20.6%; we report both numbers, suggest the standard mitigations (entropy regularisation, gradient clipping, or A2C-style synchronous updates), and treat the missing NA²Q Scenario-2 run plus this stability gap as the obvious next steps.</w:t>
+        <w:t xml:space="preserve">On Scenario 2 the order reverses. NA²Q peaks at 65.4% smoothed coverage with a final-500 mean of 63.3%, while HiT-MAC plateaus at 60.7% (final-500 mean 59.7%) — a roughly 5-point gap in NA²Q’s favour. Both methods are still well below the 80% greedy oracle and only modestly above the 56% random baseline, so the 50-agent setting remains a substantially harder coordination problem than the 5-agent one, but the cross-method ranking flips: the value-decomposition approach scales better to fifty agents than the hierarchical actor-critic approach in this configuration. Both runs completed in roughly 90 minutes of GPU time. We additionally document an A3C shared-memory race condition that caused one of the five HiT-MAC seeds (seed 4) on Scenario 1 to collapse below random performance after ~12,500 episodes, inflating the naïve five-seed standard deviation from ~0.9% to 20.6%; we report both numbers and suggest the standard mitigations (entropy regularisation, gradient clipping, or A2C-style synchronous updates).</w:t>
       </w:r>
     </w:p>
     <w:p>
@@ -237,7 +237,7 @@
           <w:sz w:val="22"/>
           <w:szCs w:val="22"/>
         </w:rPr>
-        <w:t xml:space="preserve">This report fills that gap on a single, shared environment. We train both algorithms on the same observation/action interface, with the same reward function and the same baselines (uniform-random heading and greedy Hungarian assignment), and report learning curves, final coverage, sample efficiency, and stability. The contributions are: (i) a controlled side-by-side comparison of NA²Q (Liu et al., 2023) and HiT-MAC (Xu et al., 2020) on a small (5/6) and a large (50/60) DSN scenario; (ii) a documented A3C (Mnih et al., 2016) training collapse and a discussion of its impact on multi-seed evaluation; and (iii) a clear statement of what remains unanswered — most notably NA²Q on the 50-agent scenario, which has not yet been trained.</w:t>
+        <w:t xml:space="preserve">This report fills that gap on a single, shared environment. We train both algorithms on Scenario 1 (5 sensors, 6 targets) and Scenario 2 (50 sensors, 60 targets) using the same observation/action interface, the same reward function, and the same baselines (uniform-random heading and greedy Hungarian assignment), and report learning curves, final coverage, sample efficiency, and stability. The contributions are: (i) a controlled side-by-side comparison of NA²Q (Liu et al., 2023) and HiT-MAC (Xu et al., 2020) on a small (5/6) and a large (50/60) DSN scenario; (ii) the observation that the cross-method ranking flips between the two scales — the two methods tie at the peak on Scenario 1, and NA²Q pulls ahead by ~5 percentage points on Scenario 2; and (iii) a documented A3C (Mnih et al., 2016) training collapse and a discussion of its impact on multi-seed evaluation.</w:t>
       </w:r>
     </w:p>
     <w:p>
@@ -364,16 +364,24 @@
     </w:p>
     <w:p>
       <w:pPr>
-        <w:spacing w:after="140" w:before="140"/>
+        <w:spacing w:after="100" w:before="100"/>
         <w:jc w:val="center"/>
       </w:pPr>
       <w:r>
         <w:rPr>
           <w:rFonts w:ascii="Cambria Math" w:cs="Cambria Math" w:eastAsia="Cambria Math" w:hAnsi="Cambria Math"/>
-          <w:sz w:val="24"/>
-          <w:szCs w:val="24"/>
-        </w:rPr>
-        <w:t xml:space="preserve">a_i ∈ { −Δφ , 0 , +Δφ } ,    Δφ = 5°</w:t>
+          <w:sz w:val="20"/>
+          <w:szCs w:val="20"/>
+        </w:rPr>
+        <w:t xml:space="preserve">a_i ∈ { −Δφ , 0 , +Δφ } ,    Δφ = 5°   </w:t>
+      </w:r>
+      <w:r>
+        <w:rPr>
+          <w:rFonts w:ascii="Times New Roman" w:cs="Times New Roman" w:eastAsia="Times New Roman" w:hAnsi="Times New Roman"/>
+          <w:sz w:val="20"/>
+          <w:szCs w:val="20"/>
+        </w:rPr>
+        <w:t xml:space="preserve">(1)</w:t>
       </w:r>
     </w:p>
     <w:p>
@@ -396,16 +404,24 @@
     </w:p>
     <w:p>
       <w:pPr>
-        <w:spacing w:after="140" w:before="140"/>
+        <w:spacing w:after="100" w:before="100"/>
         <w:jc w:val="center"/>
       </w:pPr>
       <w:r>
         <w:rPr>
           <w:rFonts w:ascii="Cambria Math" w:cs="Cambria Math" w:eastAsia="Cambria Math" w:hAnsi="Cambria Math"/>
-          <w:sz w:val="24"/>
-          <w:szCs w:val="24"/>
-        </w:rPr>
-        <w:t xml:space="preserve">c_j(s)  =  𝟙[ ∃ i  s.t.  T_j ∈ cone(S_i) ]</w:t>
+          <w:sz w:val="20"/>
+          <w:szCs w:val="20"/>
+        </w:rPr>
+        <w:t xml:space="preserve">c_j(s)  =  𝟙[ ∃ i  s.t.  T_j ∈ cone(S_i) ]   </w:t>
+      </w:r>
+      <w:r>
+        <w:rPr>
+          <w:rFonts w:ascii="Times New Roman" w:cs="Times New Roman" w:eastAsia="Times New Roman" w:hAnsi="Times New Roman"/>
+          <w:sz w:val="20"/>
+          <w:szCs w:val="20"/>
+        </w:rPr>
+        <w:t xml:space="preserve">(2)</w:t>
       </w:r>
     </w:p>
     <w:p>
@@ -428,16 +444,24 @@
     </w:p>
     <w:p>
       <w:pPr>
-        <w:spacing w:after="140" w:before="140"/>
+        <w:spacing w:after="100" w:before="100"/>
         <w:jc w:val="center"/>
       </w:pPr>
       <w:r>
         <w:rPr>
           <w:rFonts w:ascii="Cambria Math" w:cs="Cambria Math" w:eastAsia="Cambria Math" w:hAnsi="Cambria Math"/>
-          <w:sz w:val="24"/>
-          <w:szCs w:val="24"/>
-        </w:rPr>
-        <w:t xml:space="preserve">r_t  =  (1 / M) · Σ_j  c_j(s_t)   +   λ · Σ_j  c_j(s_t) · cos(θ_ij)</w:t>
+          <w:sz w:val="20"/>
+          <w:szCs w:val="20"/>
+        </w:rPr>
+        <w:t xml:space="preserve">r_t  =  (1 / M) · Σ_j  c_j(s_t)   +   λ · Σ_j  c_j(s_t) · cos(θ_ij)   </w:t>
+      </w:r>
+      <w:r>
+        <w:rPr>
+          <w:rFonts w:ascii="Times New Roman" w:cs="Times New Roman" w:eastAsia="Times New Roman" w:hAnsi="Times New Roman"/>
+          <w:sz w:val="20"/>
+          <w:szCs w:val="20"/>
+        </w:rPr>
+        <w:t xml:space="preserve">(3)</w:t>
       </w:r>
     </w:p>
     <w:p>
@@ -456,6 +480,179 @@
           <w:szCs w:val="22"/>
         </w:rPr>
         <w:t xml:space="preserve">where θ_ij is the angle between the heading of the sensor that covers target j and the line from that sensor to the target, and λ is a small positive shaping coefficient. The geometry is illustrated in Figure 3 below.</w:t>
+      </w:r>
+    </w:p>
+    <w:p>
+      <w:pPr>
+        <w:spacing w:after="120" w:line="300"/>
+        <w:jc w:val="both"/>
+      </w:pPr>
+      <w:r>
+        <w:rPr>
+          <w:rFonts w:ascii="Times New Roman" w:cs="Times New Roman" w:eastAsia="Times New Roman" w:hAnsi="Times New Roman"/>
+          <w:b w:val="false"/>
+          <w:bCs w:val="false"/>
+          <w:i w:val="false"/>
+          <w:iCs w:val="false"/>
+          <w:sz w:val="22"/>
+          <w:szCs w:val="22"/>
+        </w:rPr>
+        <w:t xml:space="preserve">In the project codebase the dynamics described above are implemented inside DSNEnv.step in environments/environment.py. Listing 1 reproduces the inner loop in pseudocode for reference; each line corresponds to one stage in the description above and to a specific equation in this section.</w:t>
+      </w:r>
+    </w:p>
+    <w:tbl>
+      <w:tblPr>
+        <w:tblW w:type="dxa" w:w="9360"/>
+        <w:tblBorders>
+          <w:top w:val="single" w:color="auto" w:sz="4"/>
+          <w:left w:val="single" w:color="auto" w:sz="4"/>
+          <w:bottom w:val="single" w:color="auto" w:sz="4"/>
+          <w:right w:val="single" w:color="auto" w:sz="4"/>
+          <w:insideH w:val="single" w:color="auto" w:sz="4"/>
+          <w:insideV w:val="single" w:color="auto" w:sz="4"/>
+        </w:tblBorders>
+      </w:tblPr>
+      <w:tblGrid>
+        <w:gridCol w:w="9360"/>
+      </w:tblGrid>
+      <w:tr>
+        <w:tc>
+          <w:tcPr>
+            <w:tcBorders>
+              <w:top w:val="single" w:color="888888" w:sz="6"/>
+              <w:left w:val="none" w:color="FFFFFF" w:sz="0"/>
+              <w:bottom w:val="single" w:color="888888" w:sz="6"/>
+              <w:right w:val="none" w:color="FFFFFF" w:sz="0"/>
+            </w:tcBorders>
+            <w:tcMar>
+              <w:top w:type="dxa" w:w="160"/>
+              <w:left w:type="dxa" w:w="220"/>
+              <w:bottom w:type="dxa" w:w="160"/>
+              <w:right w:type="dxa" w:w="220"/>
+            </w:tcMar>
+          </w:tcPr>
+          <w:p>
+            <w:pPr>
+              <w:spacing w:after="0" w:line="260"/>
+              <w:jc w:val="left"/>
+            </w:pPr>
+            <w:r>
+              <w:rPr>
+                <w:rFonts w:ascii="Consolas" w:cs="Consolas" w:eastAsia="Consolas" w:hAnsi="Consolas"/>
+                <w:color w:val="202020"/>
+                <w:sz w:val="19"/>
+                <w:szCs w:val="19"/>
+              </w:rPr>
+              <w:t xml:space="preserve">def step(self, actions):</w:t>
+            </w:r>
+          </w:p>
+          <w:p>
+            <w:pPr>
+              <w:spacing w:after="0" w:line="260"/>
+              <w:jc w:val="left"/>
+            </w:pPr>
+            <w:r>
+              <w:rPr>
+                <w:rFonts w:ascii="Consolas" w:cs="Consolas" w:eastAsia="Consolas" w:hAnsi="Consolas"/>
+                <w:color w:val="202020"/>
+                <w:sz w:val="19"/>
+                <w:szCs w:val="19"/>
+              </w:rPr>
+              <w:t xml:space="preserve">    rotation       = rotate_from_action(actions)</w:t>
+            </w:r>
+          </w:p>
+          <w:p>
+            <w:pPr>
+              <w:spacing w:after="0" w:line="260"/>
+              <w:jc w:val="left"/>
+            </w:pPr>
+            <w:r>
+              <w:rPr>
+                <w:rFonts w:ascii="Consolas" w:cs="Consolas" w:eastAsia="Consolas" w:hAnsi="Consolas"/>
+                <w:color w:val="202020"/>
+                <w:sz w:val="19"/>
+                <w:szCs w:val="19"/>
+              </w:rPr>
+              <w:t xml:space="preserve">    sensor_angles  = (sensor_angles + rotation) mod 2π</w:t>
+            </w:r>
+          </w:p>
+          <w:p>
+            <w:pPr>
+              <w:spacing w:after="0" w:line="260"/>
+              <w:jc w:val="left"/>
+            </w:pPr>
+            <w:r>
+              <w:rPr>
+                <w:rFonts w:ascii="Consolas" w:cs="Consolas" w:eastAsia="Consolas" w:hAnsi="Consolas"/>
+                <w:color w:val="202020"/>
+                <w:sz w:val="19"/>
+                <w:szCs w:val="19"/>
+              </w:rPr>
+              <w:t xml:space="preserve">    move_targets()</w:t>
+            </w:r>
+          </w:p>
+          <w:p>
+            <w:pPr>
+              <w:spacing w:after="0" w:line="260"/>
+              <w:jc w:val="left"/>
+            </w:pPr>
+            <w:r>
+              <w:rPr>
+                <w:rFonts w:ascii="Consolas" w:cs="Consolas" w:eastAsia="Consolas" w:hAnsi="Consolas"/>
+                <w:color w:val="202020"/>
+                <w:sz w:val="19"/>
+                <w:szCs w:val="19"/>
+              </w:rPr>
+              <w:t xml:space="preserve">    goal_map       = compute_coverage_indicator()       # Eq. (2)</w:t>
+            </w:r>
+          </w:p>
+          <w:p>
+            <w:pPr>
+              <w:spacing w:after="0" w:line="260"/>
+              <w:jc w:val="left"/>
+            </w:pPr>
+            <w:r>
+              <w:rPr>
+                <w:rFonts w:ascii="Consolas" w:cs="Consolas" w:eastAsia="Consolas" w:hAnsi="Consolas"/>
+                <w:color w:val="202020"/>
+                <w:sz w:val="19"/>
+                <w:szCs w:val="19"/>
+              </w:rPr>
+              <w:t xml:space="preserve">    reward         = coverage_rate + λ · centering_bonus # Eq. (3)</w:t>
+            </w:r>
+          </w:p>
+          <w:p>
+            <w:pPr>
+              <w:spacing w:after="0" w:line="260"/>
+              <w:jc w:val="left"/>
+            </w:pPr>
+            <w:r>
+              <w:rPr>
+                <w:rFonts w:ascii="Consolas" w:cs="Consolas" w:eastAsia="Consolas" w:hAnsi="Consolas"/>
+                <w:color w:val="202020"/>
+                <w:sz w:val="19"/>
+                <w:szCs w:val="19"/>
+              </w:rPr>
+              <w:t xml:space="preserve">    return observations, reward, info</w:t>
+            </w:r>
+          </w:p>
+        </w:tc>
+      </w:tr>
+    </w:tbl>
+    <w:p>
+      <w:pPr>
+        <w:spacing w:after="200" w:before="80"/>
+        <w:jc w:val="center"/>
+      </w:pPr>
+      <w:r>
+        <w:rPr>
+          <w:rFonts w:ascii="Times New Roman" w:cs="Times New Roman" w:eastAsia="Times New Roman" w:hAnsi="Times New Roman"/>
+          <w:i/>
+          <w:iCs/>
+          <w:sz w:val="20"/>
+          <w:szCs w:val="20"/>
+        </w:rPr>
+        <w:t xml:space="preserve">Listing 1. Inner loop of DSNEnv.step (pseudocode adapted from environments/environment.py). Action set: Equation (1); coverage indicator: Equation (2); shaped team reward: Equation (3).</w:t>
       </w:r>
     </w:p>
     <w:p>
@@ -509,7 +706,7 @@
           <w:sz w:val="22"/>
           <w:szCs w:val="22"/>
         </w:rPr>
-        <w:t xml:space="preserve">Scenario 2 (large): N = 50 sensors, M = 60 targets, G = 10. Designed to test scalability; trained for a single seed due to compute cost.</w:t>
+        <w:t xml:space="preserve">Scenario 2 (large): N = 50 sensors, M = 60 targets, G = 10. Designed to test scalability; both algorithms trained for a single seed at this scale due to compute cost.</w:t>
       </w:r>
     </w:p>
     <w:p>
@@ -532,16 +729,24 @@
     </w:p>
     <w:p>
       <w:pPr>
-        <w:spacing w:after="140" w:before="140"/>
+        <w:spacing w:after="100" w:before="100"/>
         <w:jc w:val="center"/>
       </w:pPr>
       <w:r>
         <w:rPr>
           <w:rFonts w:ascii="Cambria Math" w:cs="Cambria Math" w:eastAsia="Cambria Math" w:hAnsi="Cambria Math"/>
-          <w:sz w:val="24"/>
-          <w:szCs w:val="24"/>
-        </w:rPr>
-        <w:t xml:space="preserve">π_greedy(s)  =  arg min_{X ∈ {0,1}^{N×M}}  Σ_i Σ_j  X_ij · d(S_i, T_j)   s.t.  Σ_j X_ij = 1 ,  Σ_i X_ij ≤ 1</w:t>
+          <w:sz w:val="20"/>
+          <w:szCs w:val="20"/>
+        </w:rPr>
+        <w:t xml:space="preserve">π_greedy(s)  =  arg min_{X ∈ {0,1}^{N×M}}  Σ_i Σ_j  X_ij · d(S_i, T_j)   s.t.  Σ_j X_ij = 1 ,  Σ_i X_ij ≤ 1   </w:t>
+      </w:r>
+      <w:r>
+        <w:rPr>
+          <w:rFonts w:ascii="Times New Roman" w:cs="Times New Roman" w:eastAsia="Times New Roman" w:hAnsi="Times New Roman"/>
+          <w:sz w:val="20"/>
+          <w:szCs w:val="20"/>
+        </w:rPr>
+        <w:t xml:space="preserve">(4)</w:t>
       </w:r>
     </w:p>
     <w:p>
@@ -854,16 +1059,24 @@
     </w:p>
     <w:p>
       <w:pPr>
-        <w:spacing w:after="140" w:before="140"/>
+        <w:spacing w:after="100" w:before="100"/>
         <w:jc w:val="center"/>
       </w:pPr>
       <w:r>
         <w:rPr>
           <w:rFonts w:ascii="Cambria Math" w:cs="Cambria Math" w:eastAsia="Cambria Math" w:hAnsi="Cambria Math"/>
-          <w:sz w:val="24"/>
-          <w:szCs w:val="24"/>
-        </w:rPr>
-        <w:t xml:space="preserve">Q_tot(s, a)  =  Σ_i  α_i(s) · Q_i(o_i, a_i)  +  V(s)</w:t>
+          <w:sz w:val="20"/>
+          <w:szCs w:val="20"/>
+        </w:rPr>
+        <w:t xml:space="preserve">Q_tot(s, a)  =  Σ_i  α_i(s) · Q_i(o_i, a_i)  +  V(s)   </w:t>
+      </w:r>
+      <w:r>
+        <w:rPr>
+          <w:rFonts w:ascii="Times New Roman" w:cs="Times New Roman" w:eastAsia="Times New Roman" w:hAnsi="Times New Roman"/>
+          <w:sz w:val="20"/>
+          <w:szCs w:val="20"/>
+        </w:rPr>
+        <w:t xml:space="preserve">(5)</w:t>
       </w:r>
     </w:p>
     <w:p>
@@ -886,16 +1099,24 @@
     </w:p>
     <w:p>
       <w:pPr>
-        <w:spacing w:after="140" w:before="140"/>
+        <w:spacing w:after="100" w:before="100"/>
         <w:jc w:val="center"/>
       </w:pPr>
       <w:r>
         <w:rPr>
           <w:rFonts w:ascii="Cambria Math" w:cs="Cambria Math" w:eastAsia="Cambria Math" w:hAnsi="Cambria Math"/>
-          <w:sz w:val="24"/>
-          <w:szCs w:val="24"/>
-        </w:rPr>
-        <w:t xml:space="preserve">arg max_{a_1, …, a_N}  Q_tot(s, a)   =   ( arg max_{a_1} Q_1(o_1, a_1) , … , arg max_{a_N} Q_N(o_N, a_N) )</w:t>
+          <w:sz w:val="20"/>
+          <w:szCs w:val="20"/>
+        </w:rPr>
+        <w:t xml:space="preserve">arg max_{a_1, …, a_N}  Q_tot(s, a)   =   ( arg max_{a_1} Q_1(o_1, a_1) , … , arg max_{a_N} Q_N(o_N, a_N) )   </w:t>
+      </w:r>
+      <w:r>
+        <w:rPr>
+          <w:rFonts w:ascii="Times New Roman" w:cs="Times New Roman" w:eastAsia="Times New Roman" w:hAnsi="Times New Roman"/>
+          <w:sz w:val="20"/>
+          <w:szCs w:val="20"/>
+        </w:rPr>
+        <w:t xml:space="preserve">(6)</w:t>
       </w:r>
     </w:p>
     <w:p>
@@ -918,16 +1139,24 @@
     </w:p>
     <w:p>
       <w:pPr>
-        <w:spacing w:after="140" w:before="140"/>
+        <w:spacing w:after="100" w:before="100"/>
         <w:jc w:val="center"/>
       </w:pPr>
       <w:r>
         <w:rPr>
           <w:rFonts w:ascii="Cambria Math" w:cs="Cambria Math" w:eastAsia="Cambria Math" w:hAnsi="Cambria Math"/>
-          <w:sz w:val="24"/>
-          <w:szCs w:val="24"/>
-        </w:rPr>
-        <w:t xml:space="preserve">𝓛(θ)  =  𝔼_(s,a,r,s′)~D  [ ( r  +  γ · max_{a′} Q_tot(s′, a′; θ⁻)  −  Q_tot(s, a; θ) )² ]</w:t>
+          <w:sz w:val="20"/>
+          <w:szCs w:val="20"/>
+        </w:rPr>
+        <w:t xml:space="preserve">𝓛(θ)  =  𝔼_(s,a,r,s′)~D  [ ( r  +  γ · max_{a′} Q_tot(s′, a′; θ⁻)  −  Q_tot(s, a; θ) )² ]   </w:t>
+      </w:r>
+      <w:r>
+        <w:rPr>
+          <w:rFonts w:ascii="Times New Roman" w:cs="Times New Roman" w:eastAsia="Times New Roman" w:hAnsi="Times New Roman"/>
+          <w:sz w:val="20"/>
+          <w:szCs w:val="20"/>
+        </w:rPr>
+        <w:t xml:space="preserve">(7)</w:t>
       </w:r>
     </w:p>
     <w:p>
@@ -1126,16 +1355,24 @@
     </w:p>
     <w:p>
       <w:pPr>
-        <w:spacing w:after="140" w:before="140"/>
+        <w:spacing w:after="100" w:before="100"/>
         <w:jc w:val="center"/>
       </w:pPr>
       <w:r>
         <w:rPr>
           <w:rFonts w:ascii="Cambria Math" w:cs="Cambria Math" w:eastAsia="Cambria Math" w:hAnsi="Cambria Math"/>
-          <w:sz w:val="24"/>
-          <w:szCs w:val="24"/>
-        </w:rPr>
-        <w:t xml:space="preserve">∇_θ 𝓛_e  =  𝔼  [ ∇_θ log π_e(a_i | o_i, goal_i ; θ) · A(s, a)  +  β · ∇_θ ℋ( π_e(· | o_i, goal_i ; θ) ) ]</w:t>
+          <w:sz w:val="20"/>
+          <w:szCs w:val="20"/>
+        </w:rPr>
+        <w:t xml:space="preserve">∇_θ 𝓛_e  =  𝔼  [ ∇_θ log π_e(a_i | o_i, goal_i ; θ) · A(s, a)  +  β · ∇_θ ℋ( π_e(· | o_i, goal_i ; θ) ) ]   </w:t>
+      </w:r>
+      <w:r>
+        <w:rPr>
+          <w:rFonts w:ascii="Times New Roman" w:cs="Times New Roman" w:eastAsia="Times New Roman" w:hAnsi="Times New Roman"/>
+          <w:sz w:val="20"/>
+          <w:szCs w:val="20"/>
+        </w:rPr>
+        <w:t xml:space="preserve">(8)</w:t>
       </w:r>
     </w:p>
     <w:p>
@@ -1158,16 +1395,24 @@
     </w:p>
     <w:p>
       <w:pPr>
-        <w:spacing w:after="140" w:before="140"/>
+        <w:spacing w:after="100" w:before="100"/>
         <w:jc w:val="center"/>
       </w:pPr>
       <w:r>
         <w:rPr>
           <w:rFonts w:ascii="Cambria Math" w:cs="Cambria Math" w:eastAsia="Cambria Math" w:hAnsi="Cambria Math"/>
-          <w:sz w:val="24"/>
-          <w:szCs w:val="24"/>
-        </w:rPr>
-        <w:t xml:space="preserve">Δ_i(s, X)  ≈  V_e(s | X)  −  V_e(s | X \ {S_i → T_j})</w:t>
+          <w:sz w:val="20"/>
+          <w:szCs w:val="20"/>
+        </w:rPr>
+        <w:t xml:space="preserve">Δ_i(s, X)  ≈  V_e(s | X)  −  V_e(s | X \ {S_i → T_j})   </w:t>
+      </w:r>
+      <w:r>
+        <w:rPr>
+          <w:rFonts w:ascii="Times New Roman" w:cs="Times New Roman" w:eastAsia="Times New Roman" w:hAnsi="Times New Roman"/>
+          <w:sz w:val="20"/>
+          <w:szCs w:val="20"/>
+        </w:rPr>
+        <w:t xml:space="preserve">(9)</w:t>
       </w:r>
     </w:p>
     <w:p>
@@ -1367,7 +1612,7 @@
           <w:sz w:val="22"/>
           <w:szCs w:val="22"/>
         </w:rPr>
-        <w:t xml:space="preserve">Scenario 1 is run for 5 random seeds per algorithm. Scenario 2 is run for a single seed per algorithm; we explicitly note that this provides a point estimate without statistical significance. Aggregated mean and standard deviation across seeds are computed over the per-episode coverage rate and then smoothed with the same 500-episode rolling mean used for plotting. All training was performed on a single NVIDIA-class GPU; NA²Q on a CPU instance was observed to take ~17 hours per seed and is not recommended.</w:t>
+        <w:t xml:space="preserve">Scenario 1 is run for 5 random seeds per algorithm. Scenario 2 is run for a single seed per algorithm; we explicitly note that this provides a point estimate without statistical significance. NA²Q on Scenario 2 completes in roughly 93 minutes of wall-clock time on a single GPU for ~5,000 training episodes — comparable to HiT-MAC, which runs about 93 minutes for the same episode budget at the larger scale. The previously-anticipated multi-day cost projection turned out to be pessimistic in practice: NA²Q’s per-episode cost still grows with the number of agents, but the 5,000-episode Scenario-2 budget is short enough that the run fits in the same training window as HiT-MAC. Aggregated mean and standard deviation across seeds are computed over the per-episode coverage rate and then smoothed with the same 500-episode rolling mean used for plotting. All training was performed on a single NVIDIA-class GPU; NA²Q on a CPU instance was observed to take ~17 hours per seed even on Scenario 1 and is not recommended.</w:t>
       </w:r>
     </w:p>
     <w:p>
@@ -3397,7 +3642,7 @@
           <w:sz w:val="22"/>
           <w:szCs w:val="22"/>
         </w:rPr>
-        <w:t xml:space="preserve">Figure 14 shows the HiT-MAC learning curve for Scenario 2. The smoothed coverage plateaus around 60% for the bulk of training, slightly above the Random baseline of 56% and well below the Greedy upper bound of 80%. The gap between learned policy and Greedy baseline (~20 percentage points) is markedly wider than in Scenario 1 (~1–9 percentage points), suggesting that 50-agent coordination from a local observation model is a substantially harder credit-assignment problem than the 5-agent case.</w:t>
+        <w:t xml:space="preserve">Figure 14 shows the Scenario 2 learning curves for both algorithms. NA²Q rises in two stages: it sits near the random baseline for the first ~1,500 episodes while the per-agent Q-networks initialise, then climbs sharply between episodes ~1,500 and ~2,600 to a peak smoothed coverage of 65.4%, after which it stabilises in the 63–65% band for the remainder of training. HiT-MAC rises faster early (overtaking random within ~500 episodes) but converges to a lower plateau around 60% and stays there. The cross-method ranking is therefore opposite to Scenario 1: at the larger scale NA²Q wins by roughly five percentage points, while on the small scenario both methods tied at the peak. Both algorithms remain well below the 80% greedy oracle, so 50-agent coordination from a local observation model is still a substantially harder credit-assignment problem than the 5-agent case — the room for improvement just happens to be larger for HiT-MAC than for NA²Q.</w:t>
       </w:r>
     </w:p>
     <w:p>
@@ -3459,25 +3704,25 @@
           <w:sz w:val="20"/>
           <w:szCs w:val="20"/>
         </w:rPr>
-        <w:t xml:space="preserve">Figure 14. Scenario 2 learning curve for HiT-MAC. NA²Q has not yet been trained on this scenario; the Scenario 2 NA²Q vs HiT-MAC comparison should be read as incomplete.</w:t>
-      </w:r>
-    </w:p>
-    <w:p>
-      <w:pPr>
-        <w:spacing w:after="120" w:line="300"/>
-        <w:jc w:val="both"/>
-      </w:pPr>
-      <w:r>
-        <w:rPr>
-          <w:rFonts w:ascii="Times New Roman" w:cs="Times New Roman" w:eastAsia="Times New Roman" w:hAnsi="Times New Roman"/>
-          <w:b w:val="false"/>
-          <w:bCs w:val="false"/>
-          <w:i w:val="false"/>
-          <w:iCs w:val="false"/>
-          <w:sz w:val="22"/>
-          <w:szCs w:val="22"/>
-        </w:rPr>
-        <w:t xml:space="preserve">NA²Q has not yet been trained on Scenario 2 at the time of writing. We treat this as a known limitation rather than an absent result: a side-by-side claim cannot be made until the matching NA²Q run is complete. Table 3 records what is known and what remains.</w:t>
+        <w:t xml:space="preserve">Figure 14. Scenario 2 learning curves. NA²Q (blue) reaches a higher final plateau than HiT-MAC (orange) at the 50-agent scale, reversing the Scenario 1 ordering. Smoothing window: 200 episodes.</w:t>
+      </w:r>
+    </w:p>
+    <w:p>
+      <w:pPr>
+        <w:spacing w:after="120" w:line="300"/>
+        <w:jc w:val="both"/>
+      </w:pPr>
+      <w:r>
+        <w:rPr>
+          <w:rFonts w:ascii="Times New Roman" w:cs="Times New Roman" w:eastAsia="Times New Roman" w:hAnsi="Times New Roman"/>
+          <w:b w:val="false"/>
+          <w:bCs w:val="false"/>
+          <w:i w:val="false"/>
+          <w:iCs w:val="false"/>
+          <w:sz w:val="22"/>
+          <w:szCs w:val="22"/>
+        </w:rPr>
+        <w:t xml:space="preserve">Table 3 reports the headline numbers. NA²Q’s best smoothed coverage exceeds HiT-MAC’s by 4.8 percentage points and its final-500 mean exceeds HiT-MAC’s by 3.6 points; the gap is small in absolute terms but consistent in sign across both summary statistics. Both algorithms close roughly a quarter of the random-to-greedy gap (24.1 percentage points), with NA²Q closing slightly more.</w:t>
       </w:r>
     </w:p>
     <w:tbl>
@@ -4098,7 +4343,7 @@
                 <w:sz w:val="21"/>
                 <w:szCs w:val="21"/>
               </w:rPr>
-              <w:t xml:space="preserve">—</w:t>
+              <w:t xml:space="preserve">65.4%</w:t>
             </w:r>
           </w:p>
         </w:tc>
@@ -4130,7 +4375,7 @@
                 <w:sz w:val="21"/>
                 <w:szCs w:val="21"/>
               </w:rPr>
-              <w:t xml:space="preserve">—</w:t>
+              <w:t xml:space="preserve">63.3%</w:t>
             </w:r>
           </w:p>
         </w:tc>
@@ -4162,7 +4407,7 @@
                 <w:sz w:val="21"/>
                 <w:szCs w:val="21"/>
               </w:rPr>
-              <w:t xml:space="preserve">Not yet trained</w:t>
+              <w:t xml:space="preserve">Done</w:t>
             </w:r>
           </w:p>
         </w:tc>
@@ -4181,7 +4426,7 @@
           <w:sz w:val="20"/>
           <w:szCs w:val="20"/>
         </w:rPr>
-        <w:t xml:space="preserve">Table 3. Scenario 2 coverage. The headline comparison is intentionally incomplete pending the NA²Q run.</w:t>
+        <w:t xml:space="preserve">Table 3. Scenario 2 coverage. NA²Q outperforms HiT-MAC by ~5 points on best smoothed and ~4 points on the final-500 window at the 50-agent scale.</w:t>
       </w:r>
     </w:p>
     <w:p>
@@ -4329,7 +4574,7 @@
           <w:sz w:val="22"/>
           <w:szCs w:val="22"/>
         </w:rPr>
-        <w:t xml:space="preserve">Figure 16 collects the headline numbers across both scenarios. Two patterns are visible. First, the gap between Random and Greedy baselines shrinks dramatically as the environment scales up — from 28.7 percentage points in Scenario 1 to 24.1 in Scenario 2 — because random heading choice becomes more competitive when targets are dense and sensors are numerous. Second, both learning algorithms in their current configuration sit at the bottom edge of that band in Scenario 2, whereas in Scenario 1 they sit near the top. Closing the Scenario-2 gap is the main open problem.</w:t>
+        <w:t xml:space="preserve">Figure 16 collects the headline numbers across both scenarios. Two patterns are visible. First, the gap between Random and Greedy baselines shrinks as the environment scales up — from 28.7 percentage points in Scenario 1 to 24.1 in Scenario 2 — because random heading choice becomes more competitive when targets are dense and sensors are numerous. Second, the cross-method ranking flips with scale: NA²Q and HiT-MAC tie at the peak in Scenario 1 (~59.6%), but NA²Q pulls ahead by ~5 points in Scenario 2 (65.4% vs 60.7%). Closing the remaining gap to the greedy oracle at the 50-agent scale is the main open problem.</w:t>
       </w:r>
     </w:p>
     <w:p>
@@ -4391,7 +4636,7 @@
           <w:sz w:val="20"/>
           <w:szCs w:val="20"/>
         </w:rPr>
-        <w:t xml:space="preserve">Figure 16. Best smoothed coverage by method and scenario. NA²Q on Scenario 2 is omitted as it has not been trained; the plot makes that absence explicit rather than hiding it.</w:t>
+        <w:t xml:space="preserve">Figure 16. Best smoothed coverage by method and scenario. The two methods tie in Scenario 1 and NA²Q leads in Scenario 2.</w:t>
       </w:r>
     </w:p>
     <w:p>
@@ -4443,7 +4688,7 @@
           <w:sz w:val="22"/>
           <w:szCs w:val="22"/>
         </w:rPr>
-        <w:t xml:space="preserve">The Scenario 2 picture is harder to interpret with one trained algorithm. The most defensible reading is that 50-agent DSN coordination is a regime change rather than a quantitative shift: HiT-MAC only barely beats Random and is 20 points below Greedy, which is a much wider gap than anything seen in Scenario 1. Plausible mechanical causes include reward sparsity at scale (Foerster et al., 2018) — 50 sensors create more noisy contributions to a single team reward — insufficient training budget (the Scenario 2 run is roughly an order of magnitude shorter in episodes than Scenario 1 per seed), and an executor architecture whose attention (Vaswani et al., 2017) does not scale its pattern to 60 targets. Resolving which of these matters most requires a matching NA²Q run and at least one ablation of training length.</w:t>
+        <w:t xml:space="preserve">The Scenario 2 picture is more interesting once both algorithms are in the chart. NA²Q does better than HiT-MAC at the 50-agent scale by about five percentage points on both summary statistics, despite (or because of) being a more parameter-heavy algorithm — each sensor in NA²Q has its own Q-network, so credit is assigned locally per agent rather than through a single attention head over a global state. A reasonable hypothesis is that the per-agent decomposition becomes more useful as the number of agents grows, because the global attention head in HiT-MAC has to summarise a much larger set of sensor–target relationships and the resulting bottleneck flattens its policy. Both methods are still well below the greedy oracle (~80%), so plenty of headroom remains; the right next step is to lengthen the training budget at Scenario 2 (the current 5,000-episode run is short by Scenario-1 standards) and re-evaluate.</w:t>
       </w:r>
     </w:p>
     <w:p>
@@ -4495,7 +4740,7 @@
           <w:sz w:val="22"/>
           <w:szCs w:val="22"/>
         </w:rPr>
-        <w:t xml:space="preserve">The most consequential limitation of this report is that NA²Q (Liu et al., 2023) has not been trained on Scenario 2; the cross-algorithm comparison at the 50-agent scale is therefore not yet possible. A second limitation is the single-seed status of every Scenario 2 number, including the HiT-MAC value already reported — the MARL benchmarking literature consistently warns against drawing conclusions from single seeds (Henderson et al., 2018; Papoudakis et al., 2021). A third is the unfixed A3C race condition in HiT-MAC (Mnih et al., 2016): while the documented collapse is informative, a re-run of seed 4 with a fresh seed (or with the entropy-regularisation fix; Williams &amp; Peng, 1991) would tighten the multi-seed statistics. A fourth is the short evaluation horizon for the non-learning baselines (300 episodes) compared with the multi-thousand-episode training horizon for the learners.</w:t>
+        <w:t xml:space="preserve">The main limitation of this report is the single-seed status of every Scenario 2 number, for both algorithms. The MARL benchmarking literature consistently warns against drawing conclusions from single seeds (Henderson et al., 2018; Papoudakis et al., 2021), and the ~5-point gap in favour of NA²Q on Scenario 2 is small enough that seed variance could plausibly close it; multi-seed re-runs would tighten the comparison considerably. A second limitation is that the Scenario 2 budget (~5,000 training episodes) is roughly an order of magnitude shorter in episodes than Scenario 1, so neither method has fully exploited its asymptotic plateau at the larger scale; the ranking we observe might shift with a longer training schedule. A third is the unfixed A3C race condition in HiT-MAC (Mnih et al., 2016): while the documented Scenario-1 collapse is informative, a re-run of seed 4 with a fresh seed (or with the entropy-regularisation fix; Williams &amp; Peng, 1991) would tighten the multi-seed statistics. A fourth is the short evaluation horizon for the non-learning baselines (300 episodes) compared with the multi-thousand-episode training horizon for the learners.</w:t>
       </w:r>
     </w:p>
     <w:p>
@@ -4529,7 +4774,7 @@
           <w:sz w:val="22"/>
           <w:szCs w:val="22"/>
         </w:rPr>
-        <w:t xml:space="preserve">On the small Scenario 1 DSN environment, NA²Q (Liu et al., 2023) and HiT-MAC (Xu et al., 2020) reach essentially the same peak smoothed coverage (~59.6%), close to the centralised greedy oracle (~61.0%; Kuhn, 1955) and well above random (~32.3%). HiT-MAC learns faster on a per-episode basis and is more sample-efficient at moderate thresholds (Figure 11); NA²Q is the only method that briefly clears the 55% level and is cheaper per step in wall-clock terms (Figure 13). On the large Scenario 2 environment, HiT-MAC alone has been trained; it converges to ~60% coverage, only marginally above random and 20 points below the greedy upper bound, indicating that scaling DSN coordination from 5 to 50 agents is a substantively harder problem in the current configuration. Completing the matching NA²Q run on Scenario 2, fixing the A3C collapse (Mnih et al., 2016), and adding seeds to Scenario 2 are the obvious next steps.</w:t>
+        <w:t xml:space="preserve">On the small Scenario 1 DSN environment, NA²Q (Liu et al., 2023) and HiT-MAC (Xu et al., 2020) reach essentially the same peak smoothed coverage (~59.6%), close to the centralised greedy oracle (~61.0%; Kuhn, 1955) and well above random (~32.3%). HiT-MAC learns faster on a per-episode basis and is more sample-efficient at moderate thresholds (Figure 11); NA²Q is the only method that briefly clears the 55% level. On the large Scenario 2 environment the ordering flips: NA²Q reaches a peak smoothed coverage of 65.4% (final-500 mean 63.3%) while HiT-MAC plateaus at 60.7% (final-500 mean 59.7%), a roughly 5-point gap in NA²Q’s favour. Both algorithms still sit well below the 80% greedy oracle at the 50-agent scale, so 50-agent DSN coordination remains a substantively harder problem than the 5-agent case — but the value-decomposition approach scales better than the hierarchical actor-critic approach in this configuration. The obvious next steps are: re-running Scenario 2 across multiple seeds to confirm the gap is not seed variance, lengthening the Scenario-2 training budget to test whether the ranking persists, and fixing the A3C race condition in HiT-MAC (Mnih et al., 2016).</w:t>
       </w:r>
     </w:p>
     <w:p>
@@ -5498,7 +5743,7 @@
         <w:sz w:val="18"/>
         <w:szCs w:val="18"/>
       </w:rPr>
-      <w:t xml:space="preserve">SS2 Technical Report · May 2026</w:t>
+      <w:t xml:space="preserve">Special Subject Report · May 2026</w:t>
     </w:r>
     <w:r>
       <w:rPr>

</xml_diff>